<commit_message>
apply Pages-safe brand proofing to all templates
</commit_message>
<xml_diff>
--- a/artifacts/handbook-v1/LEGAVIK_Module1_资产与账户_汇总文档_Handbook_V1.docx
+++ b/artifacts/handbook-v1/LEGAVIK_Module1_资产与账户_汇总文档_Handbook_V1.docx
@@ -2171,7 +2171,7 @@
         <w:sz w:val="15"/>
         <w:noProof/>
       </w:rPr>
-      <w:t xml:space="preserve">LEGAVIK   ·   Last Updated: __________   ·   Page </w:t>
+      <w:t xml:space="preserve">L⁠E⁠G⁠A⁠V⁠I⁠K   ·   Last Updated: __________   ·   Page </w:t>
     </w:r>
     <w:r>
       <w:rPr>
@@ -2216,7 +2216,7 @@
         <w:sz w:val="18"/>
         <w:noProof/>
       </w:rPr>
-      <w:t>LEGAVIK · Recovery Map</w:t>
+      <w:t>L⁠E⁠G⁠A⁠V⁠I⁠K · Recovery Map</w:t>
     </w:r>
   </w:p>
 </w:hdr>
@@ -2237,7 +2237,7 @@
         <w:sz w:val="18"/>
         <w:noProof/>
       </w:rPr>
-      <w:t>LEGAVIK · Recovery Map</w:t>
+      <w:t>L⁠E⁠G⁠A⁠V⁠I⁠K · Recovery Map</w:t>
     </w:r>
   </w:p>
 </w:hdr>
@@ -2258,7 +2258,7 @@
         <w:sz w:val="18"/>
         <w:noProof/>
       </w:rPr>
-      <w:t>LEGAVIK · Recovery Map</w:t>
+      <w:t>L⁠E⁠G⁠A⁠V⁠I⁠K · Recovery Map</w:t>
     </w:r>
   </w:p>
 </w:hdr>

</xml_diff>